<commit_message>
Module trao đổi: chat theo bài nộp, theo lớp và trực tiếp 1–1, clientMsgId chống lưu trùng, thông báo tin nhắn mới qua STOMP
</commit_message>
<xml_diff>
--- a/docx/03-sequence.docx
+++ b/docx/03-sequence.docx
@@ -2904,7 +2904,7 @@
       <w:r>
         <w:drawing>
           <wp:inline>
-            <wp:extent cx="5334000" cy="2789464"/>
+            <wp:extent cx="5334000" cy="3027589"/>
             <wp:effectExtent b="0" l="0" r="0" t="0"/>
             <wp:docPr descr="Hình 03.12" title="" id="57" name="Picture"/>
             <a:graphic>
@@ -2925,7 +2925,7 @@
                   <pic:spPr bwMode="auto">
                     <a:xfrm>
                       <a:off x="0" y="0"/>
-                      <a:ext cx="5334000" cy="2789464"/>
+                      <a:ext cx="5334000" cy="3027589"/>
                     </a:xfrm>
                     <a:prstGeom prst="rect">
                       <a:avLst/>

</xml_diff>